<commit_message>
data(OPS-C5): rebuild DOCX and manifest after the fix wave
Co-Authored-By: Claude Fable 5 <noreply@anthropic.com>
Claude-Session: https://claude.ai/code/fb5a7ea0-60a8-4586-ba38-df1dfb4b16be
</commit_message>
<xml_diff>
--- a/artifacts/OPS-10/build/sop-with-unnamed-approver.docx
+++ b/artifacts/OPS-10/build/sop-with-unnamed-approver.docx
@@ -17,7 +17,7 @@
         <w:pStyle w:val="Heading2"/>
       </w:pPr>
       <w:r>
-        <w:t xml:space="preserve">Document control</w:t>
+        <w:t xml:space="preserve">Document Control</w:t>
       </w:r>
     </w:p>
     <w:tbl>
@@ -209,7 +209,7 @@
               <w:pStyle w:val="Compact"/>
             </w:pPr>
             <w:r>
-              <w:t xml:space="preserve">Last reviewed</w:t>
+              <w:t xml:space="preserve">Last Reviewed</w:t>
             </w:r>
           </w:p>
         </w:tc>
@@ -233,7 +233,7 @@
               <w:pStyle w:val="Compact"/>
             </w:pPr>
             <w:r>
-              <w:t xml:space="preserve">Next review due</w:t>
+              <w:t xml:space="preserve">Next Review Due</w:t>
             </w:r>
           </w:p>
         </w:tc>
@@ -268,7 +268,7 @@
               <w:pStyle w:val="Compact"/>
             </w:pPr>
             <w:r>
-              <w:t xml:space="preserve">none</w:t>
+              <w:t xml:space="preserve">None</w:t>
             </w:r>
           </w:p>
         </w:tc>
@@ -281,7 +281,7 @@
               <w:pStyle w:val="Compact"/>
             </w:pPr>
             <w:r>
-              <w:t xml:space="preserve">Superseded by</w:t>
+              <w:t xml:space="preserve">Superseded By</w:t>
             </w:r>
           </w:p>
         </w:tc>
@@ -292,7 +292,7 @@
               <w:pStyle w:val="Compact"/>
             </w:pPr>
             <w:r>
-              <w:t xml:space="preserve">none</w:t>
+              <w:t xml:space="preserve">None</w:t>
             </w:r>
           </w:p>
         </w:tc>

</xml_diff>